<commit_message>
Update report with bookmarklet option
Co-Authored-By: Claude Opus 5.5 <noreply@anthropic.com>
Claude-Session: https://claude.ai/code/session_01AQvRoJbu3autEaEnC9DQeD
</commit_message>
<xml_diff>
--- a/docs/Informe_importador_Amazon.docx
+++ b/docs/Informe_importador_Amazon.docx
@@ -197,6 +197,83 @@
       </w:pPr>
       <w:r>
         <w:t>El administrador sigue trabajando con borradores; aún no publica de forma persistente.</w:t>
+      </w:r>
+    </w:p>
+    <w:p>
+      <w:pPr>
+        <w:pStyle w:val="Heading2"/>
+      </w:pPr>
+      <w:r>
+        <w:t>Opción 2 implementada: botón «Añadir a Cestoria» (sin API ni costes)</w:t>
+      </w:r>
+    </w:p>
+    <w:p>
+      <w:r>
+        <w:t>Como la cuenta no cumple los requisitos de la API oficial de Afiliados, el catálogo incorpora un marcador del navegador que lee la página de Amazon que el usuario ya tiene abierta.</w:t>
+      </w:r>
+    </w:p>
+    <w:p>
+      <w:pPr>
+        <w:pStyle w:val="ListBullet"/>
+      </w:pPr>
+      <w:r>
+        <w:t>Flujo: pegar el enlace de afiliado en el administrador → «Importar» → si Amazon bloquea, «Abrir el producto en Amazon» → tocar el marcador «Añadir a Cestoria» → el administrador se abre con título, imagen en alta resolución y descripción, y con el enlace de afiliado original intacto → elegir categoría y guardar.</w:t>
+      </w:r>
+    </w:p>
+    <w:p>
+      <w:pPr>
+        <w:pStyle w:val="ListBullet"/>
+      </w:pPr>
+      <w:r>
+        <w:t>Si no se pegó antes el enlace, se usa la dirección de la página solo si lleva la etiqueta de afiliado (tag=); si no la lleva, se pide pegar el enlace. Nunca se inventa un enlace.</w:t>
+      </w:r>
+    </w:p>
+    <w:p>
+      <w:pPr>
+        <w:pStyle w:val="ListBullet"/>
+      </w:pPr>
+      <w:r>
+        <w:t>Seguridad: solo se aceptan imágenes de servidores de Amazon; los textos se insertan como texto; los datos viajan en el fragmento (#) de la URL, que no se envía a ningún servidor.</w:t>
+      </w:r>
+    </w:p>
+    <w:p>
+      <w:pPr>
+        <w:pStyle w:val="ListBullet"/>
+      </w:pPr>
+      <w:r>
+        <w:t>Los borradores ahora se guardan en el navegador (localStorage) para no perderse al ir y volver de Amazon. Siguen sin publicarse en el catálogo público.</w:t>
+      </w:r>
+    </w:p>
+    <w:p>
+      <w:pPr>
+        <w:pStyle w:val="ListBullet"/>
+      </w:pPr>
+      <w:r>
+        <w:t>Pruebas: scripts/test-admin-bookmarklet.cjs, 5 escenarios superados con páginas simuladas (escritorio, móvil, datos hostiles y uso fuera de Amazon).</w:t>
+      </w:r>
+    </w:p>
+    <w:p>
+      <w:pPr>
+        <w:pStyle w:val="ListBullet"/>
+      </w:pPr>
+      <w:r>
+        <w:t>No verificado: el funcionamiento sobre la página real de Amazon. Los selectores (productTitle, landingImage, feature-bullets, title, main-image) se basan en la estructura conocida de Amazon y Amazon puede cambiarla. Tampoco funciona dentro de la app de Amazon, solo en el navegador.</w:t>
+      </w:r>
+    </w:p>
+    <w:p>
+      <w:pPr>
+        <w:pStyle w:val="ListBullet"/>
+      </w:pPr>
+      <w:r>
+        <w:t>Pendiente para estar disponible: fusionar la rama ccr-625e2fca-7eiwjz en main para que Netlify la publique.</w:t>
+      </w:r>
+    </w:p>
+    <w:p>
+      <w:pPr>
+        <w:pStyle w:val="ListBullet"/>
+      </w:pPr>
+      <w:r>
+        <w:t>Siguientes etapas (no iniciadas): guardado permanente en el catálogo público, conexión con Instagram y con WhatsApp Business.</w:t>
       </w:r>
     </w:p>
     <w:sectPr>

</xml_diff>

<commit_message>
Update report with publishing stage
Co-Authored-By: Claude Opus 5.5 <noreply@anthropic.com>
Claude-Session: https://claude.ai/code/session_01AQvRoJbu3autEaEnC9DQeD
</commit_message>
<xml_diff>
--- a/docs/Informe_importador_Amazon.docx
+++ b/docs/Informe_importador_Amazon.docx
@@ -274,6 +274,83 @@
       </w:pPr>
       <w:r>
         <w:t>Siguientes etapas (no iniciadas): guardado permanente en el catálogo público, conexión con Instagram y con WhatsApp Business.</w:t>
+      </w:r>
+    </w:p>
+    <w:p>
+      <w:pPr>
+        <w:pStyle w:val="Heading2"/>
+      </w:pPr>
+      <w:r>
+        <w:t>Prueba real tras publicar (24-10-2026)</w:t>
+      </w:r>
+    </w:p>
+    <w:p>
+      <w:r>
+        <w:t>Con https://link.amazon/B02KjkcGI la función publicada en Netlify devolvió el título, la descripción y la imagen reales. El usuario confirmó título y descripción en su propia prueba; la imagen no salió en su caso.</w:t>
+      </w:r>
+    </w:p>
+    <w:p>
+      <w:pPr>
+        <w:pStyle w:val="Heading2"/>
+      </w:pPr>
+      <w:r>
+        <w:t>Etapa 2: publicar productos en el catálogo (PR #2)</w:t>
+      </w:r>
+    </w:p>
+    <w:p>
+      <w:pPr>
+        <w:pStyle w:val="ListBullet"/>
+      </w:pPr>
+      <w:r>
+        <w:t>Los productos se publican desde el administrador con «Publicar cambios» y una clave (variable CATALOG_ADMIN_KEY en Netlify).</w:t>
+      </w:r>
+    </w:p>
+    <w:p>
+      <w:pPr>
+        <w:pStyle w:val="ListBullet"/>
+      </w:pPr>
+      <w:r>
+        <w:t>Se guardan en Netlify Blobs. Publicar no genera un deploy: según la página de precios de Netlify, cada production deploy cuesta 15 de los 300 créditos mensuales del plan gratuito; publicar productos no los consume. Cada fusión en main sí es un deploy.</w:t>
+      </w:r>
+    </w:p>
+    <w:p>
+      <w:pPr>
+        <w:pStyle w:val="ListBullet"/>
+      </w:pPr>
+      <w:r>
+        <w:t>Protecciones: clave comparada en tiempo constante, validación de todos los campos, solo enlaces https, no se pisan cambios entre dos dispositivos, se guardan las 20 versiones anteriores, las vistas previas usan otro almacén.</w:t>
+      </w:r>
+    </w:p>
+    <w:p>
+      <w:pPr>
+        <w:pStyle w:val="ListBullet"/>
+      </w:pPr>
+      <w:r>
+        <w:t>El catálogo público lee la versión publicada y, si no hay, el archivo inicial cestoria_data.json. Los enlaces link.amazon muestran «Comprar en Amazon».</w:t>
+      </w:r>
+    </w:p>
+    <w:p>
+      <w:pPr>
+        <w:pStyle w:val="ListBullet"/>
+      </w:pPr>
+      <w:r>
+        <w:t>Corregido: el service worker ya no sirve datos viejos y se añadió el icono que faltaba (la instalación fallaba). El sitio ya no publica node_modules ni el código de las funciones.</w:t>
+      </w:r>
+    </w:p>
+    <w:p>
+      <w:pPr>
+        <w:pStyle w:val="ListBullet"/>
+      </w:pPr>
+      <w:r>
+        <w:t>Pruebas superadas: 13 comprobaciones de la función, 8 escenarios de extremo a extremo en navegador, 5 del botón, 4 del importador. La vista previa de Netlify se construyó bien, pero está protegida con contraseña (401) y no pudo probarse desde fuera; la verificación real se hará tras publicar.</w:t>
+      </w:r>
+    </w:p>
+    <w:p>
+      <w:pPr>
+        <w:pStyle w:val="ListBullet"/>
+      </w:pPr>
+      <w:r>
+        <w:t>Pendiente del usuario: crear CATALOG_ADMIN_KEY en Netlify antes de fusionar.</w:t>
       </w:r>
     </w:p>
     <w:sectPr>

</xml_diff>